<commit_message>
Deploying to gh-pages from @ kaulmegha/kaulmegha.github.io@762739f607cea136e748094cc7fce27cf4b2149e 🚀
</commit_message>
<xml_diff>
--- a/assets/cover_letter/cover_letter_astra_zeneca.docx
+++ b/assets/cover_letter/cover_letter_astra_zeneca.docx
@@ -22,6 +22,160 @@
           <w:szCs w:val="22"/>
           <w14:ligatures w14:val="none"/>
         </w:rPr>
+        <w:t>June 7, 2026</w:t>
+      </w:r>
+    </w:p>
+    <w:p>
+      <w:pPr>
+        <w:spacing w:after="0"/>
+        <w:jc w:val="both"/>
+        <w:rPr>
+          <w:rFonts w:ascii="Calibri" w:eastAsia="Calibri" w:hAnsi="Calibri" w:cs="Calibri"/>
+          <w:kern w:val="0"/>
+          <w:sz w:val="22"/>
+          <w:szCs w:val="22"/>
+          <w14:ligatures w14:val="none"/>
+        </w:rPr>
+      </w:pPr>
+    </w:p>
+    <w:p>
+      <w:pPr>
+        <w:spacing w:after="0"/>
+        <w:jc w:val="both"/>
+        <w:rPr>
+          <w:rFonts w:ascii="Calibri" w:eastAsia="Calibri" w:hAnsi="Calibri" w:cs="Calibri"/>
+          <w:kern w:val="0"/>
+          <w:sz w:val="22"/>
+          <w:szCs w:val="22"/>
+          <w14:ligatures w14:val="none"/>
+        </w:rPr>
+      </w:pPr>
+      <w:r>
+        <w:rPr>
+          <w:rFonts w:ascii="Calibri" w:eastAsia="Calibri" w:hAnsi="Calibri" w:cs="Calibri"/>
+          <w:kern w:val="0"/>
+          <w:sz w:val="22"/>
+          <w:szCs w:val="22"/>
+          <w14:ligatures w14:val="none"/>
+        </w:rPr>
+        <w:t>Hiring Manager</w:t>
+      </w:r>
+    </w:p>
+    <w:p>
+      <w:pPr>
+        <w:spacing w:after="0"/>
+        <w:jc w:val="both"/>
+        <w:rPr>
+          <w:rFonts w:ascii="Calibri" w:eastAsia="Calibri" w:hAnsi="Calibri" w:cs="Calibri"/>
+          <w:kern w:val="0"/>
+          <w:sz w:val="22"/>
+          <w:szCs w:val="22"/>
+          <w14:ligatures w14:val="none"/>
+        </w:rPr>
+      </w:pPr>
+      <w:r>
+        <w:rPr>
+          <w:rFonts w:ascii="Calibri" w:eastAsia="Calibri" w:hAnsi="Calibri" w:cs="Calibri"/>
+          <w:kern w:val="0"/>
+          <w:sz w:val="22"/>
+          <w:szCs w:val="22"/>
+          <w14:ligatures w14:val="none"/>
+        </w:rPr>
+        <w:t>AstraZeneca</w:t>
+      </w:r>
+    </w:p>
+    <w:p>
+      <w:pPr>
+        <w:spacing w:after="0"/>
+        <w:jc w:val="both"/>
+        <w:rPr>
+          <w:rFonts w:ascii="Calibri" w:eastAsia="Calibri" w:hAnsi="Calibri" w:cs="Calibri"/>
+          <w:kern w:val="0"/>
+          <w:sz w:val="22"/>
+          <w:szCs w:val="22"/>
+          <w14:ligatures w14:val="none"/>
+        </w:rPr>
+      </w:pPr>
+      <w:r>
+        <w:rPr>
+          <w:rFonts w:ascii="Calibri" w:eastAsia="Calibri" w:hAnsi="Calibri" w:cs="Calibri"/>
+          <w:kern w:val="0"/>
+          <w:sz w:val="22"/>
+          <w:szCs w:val="22"/>
+          <w14:ligatures w14:val="none"/>
+        </w:rPr>
+        <w:t>Gaithersburg, Maryland</w:t>
+      </w:r>
+    </w:p>
+    <w:p>
+      <w:pPr>
+        <w:spacing w:after="0"/>
+        <w:jc w:val="both"/>
+        <w:rPr>
+          <w:rFonts w:ascii="Calibri" w:eastAsia="Calibri" w:hAnsi="Calibri" w:cs="Calibri"/>
+          <w:kern w:val="0"/>
+          <w:sz w:val="22"/>
+          <w:szCs w:val="22"/>
+          <w14:ligatures w14:val="none"/>
+        </w:rPr>
+      </w:pPr>
+    </w:p>
+    <w:p>
+      <w:pPr>
+        <w:spacing w:after="0"/>
+        <w:jc w:val="both"/>
+        <w:rPr>
+          <w:rFonts w:ascii="Calibri" w:eastAsia="Calibri" w:hAnsi="Calibri" w:cs="Calibri"/>
+          <w:kern w:val="0"/>
+          <w:sz w:val="22"/>
+          <w:szCs w:val="22"/>
+          <w14:ligatures w14:val="none"/>
+        </w:rPr>
+      </w:pPr>
+      <w:r>
+        <w:rPr>
+          <w:rFonts w:ascii="Calibri" w:eastAsia="Calibri" w:hAnsi="Calibri" w:cs="Calibri"/>
+          <w:kern w:val="0"/>
+          <w:sz w:val="22"/>
+          <w:szCs w:val="22"/>
+          <w14:ligatures w14:val="none"/>
+        </w:rPr>
+        <w:t>Re: Associate Director, Data Product Management (R-253359)</w:t>
+      </w:r>
+    </w:p>
+    <w:p>
+      <w:pPr>
+        <w:spacing w:after="0"/>
+        <w:jc w:val="both"/>
+        <w:rPr>
+          <w:rFonts w:ascii="Calibri" w:eastAsia="Calibri" w:hAnsi="Calibri" w:cs="Calibri"/>
+          <w:kern w:val="0"/>
+          <w:sz w:val="22"/>
+          <w:szCs w:val="22"/>
+          <w14:ligatures w14:val="none"/>
+        </w:rPr>
+      </w:pPr>
+    </w:p>
+    <w:p>
+      <w:pPr>
+        <w:spacing w:after="0"/>
+        <w:jc w:val="both"/>
+        <w:rPr>
+          <w:rFonts w:ascii="Calibri" w:eastAsia="Calibri" w:hAnsi="Calibri" w:cs="Calibri"/>
+          <w:kern w:val="0"/>
+          <w:sz w:val="22"/>
+          <w:szCs w:val="22"/>
+          <w14:ligatures w14:val="none"/>
+        </w:rPr>
+      </w:pPr>
+      <w:r>
+        <w:rPr>
+          <w:rFonts w:ascii="Calibri" w:eastAsia="Calibri" w:hAnsi="Calibri" w:cs="Calibri"/>
+          <w:kern w:val="0"/>
+          <w:sz w:val="22"/>
+          <w:szCs w:val="22"/>
+          <w14:ligatures w14:val="none"/>
+        </w:rPr>
         <w:t>Dear Hiring Manager,</w:t>
       </w:r>
     </w:p>
@@ -130,79 +284,145 @@
           <w:szCs w:val="22"/>
           <w14:ligatures w14:val="none"/>
         </w:rPr>
-        <w:t>The accountabilities in this role map closely to work I do daily. I translate commercial priorities into unambiguous data requirements, manage cross-functional backlogs across product, engineering, and analytics teams, and own governance and quality standards that keep data trusted and discoverable. I have hands-on experience with Azure Databricks, data lakes, metadata management, and data catalog tooling, and I hold certifications in Azure Data Fundamentals, PSPO, and AI/RAG for product leaders. My master's degree in IT and Management with a specialization in Data Analytics from Illinois Institute of Technology, combined with a published data analysis paper, reflects the analytical depth I bring to the role.</w:t>
-      </w:r>
-    </w:p>
-    <w:p>
-      <w:pPr>
-        <w:spacing w:after="0"/>
-        <w:jc w:val="both"/>
-        <w:rPr>
-          <w:rFonts w:ascii="Calibri" w:eastAsia="Calibri" w:hAnsi="Calibri" w:cs="Calibri"/>
-          <w:kern w:val="0"/>
-          <w:sz w:val="22"/>
-          <w:szCs w:val="22"/>
-          <w14:ligatures w14:val="none"/>
-        </w:rPr>
-      </w:pPr>
-    </w:p>
-    <w:p>
-      <w:pPr>
-        <w:spacing w:after="0"/>
-        <w:jc w:val="both"/>
-        <w:rPr>
-          <w:rFonts w:ascii="Calibri" w:eastAsia="Calibri" w:hAnsi="Calibri" w:cs="Calibri"/>
-          <w:kern w:val="0"/>
-          <w:sz w:val="22"/>
-          <w:szCs w:val="22"/>
-          <w14:ligatures w14:val="none"/>
-        </w:rPr>
-      </w:pPr>
-      <w:r>
-        <w:rPr>
-          <w:rFonts w:ascii="Calibri" w:eastAsia="Calibri" w:hAnsi="Calibri" w:cs="Calibri"/>
-          <w:kern w:val="0"/>
-          <w:sz w:val="22"/>
-          <w:szCs w:val="22"/>
-          <w14:ligatures w14:val="none"/>
-        </w:rPr>
-        <w:t>What draws me most to AstraZeneca is the direct line between the data products this role owns and the outcomes that matter for patients. I am ready to bring that same product-minded, value-driven approach to your Oncology portfolio and would welcome the opportunity to discuss how I can contribute.</w:t>
-      </w:r>
-    </w:p>
-    <w:p>
-      <w:pPr>
-        <w:spacing w:after="0"/>
-        <w:jc w:val="both"/>
-        <w:rPr>
-          <w:rFonts w:ascii="Calibri" w:eastAsia="Calibri" w:hAnsi="Calibri" w:cs="Calibri"/>
-          <w:kern w:val="0"/>
-          <w:sz w:val="22"/>
-          <w:szCs w:val="22"/>
-          <w14:ligatures w14:val="none"/>
-        </w:rPr>
-      </w:pPr>
-    </w:p>
-    <w:p>
-      <w:pPr>
-        <w:spacing w:after="0"/>
-        <w:jc w:val="both"/>
-        <w:rPr>
-          <w:rFonts w:ascii="Calibri" w:eastAsia="Calibri" w:hAnsi="Calibri" w:cs="Calibri"/>
-          <w:kern w:val="0"/>
-          <w:sz w:val="22"/>
-          <w:szCs w:val="22"/>
-          <w14:ligatures w14:val="none"/>
-        </w:rPr>
-      </w:pPr>
-      <w:r>
-        <w:rPr>
-          <w:rFonts w:ascii="Calibri" w:eastAsia="Calibri" w:hAnsi="Calibri" w:cs="Calibri"/>
-          <w:kern w:val="0"/>
-          <w:sz w:val="22"/>
-          <w:szCs w:val="22"/>
-          <w14:ligatures w14:val="none"/>
-        </w:rPr>
-        <w:t>Thank you for your consideration.</w:t>
+        <w:t xml:space="preserve">My daily work maps directly </w:t>
+      </w:r>
+      <w:proofErr w:type="gramStart"/>
+      <w:r>
+        <w:rPr>
+          <w:rFonts w:ascii="Calibri" w:eastAsia="Calibri" w:hAnsi="Calibri" w:cs="Calibri"/>
+          <w:kern w:val="0"/>
+          <w:sz w:val="22"/>
+          <w:szCs w:val="22"/>
+          <w14:ligatures w14:val="none"/>
+        </w:rPr>
+        <w:t>to</w:t>
+      </w:r>
+      <w:proofErr w:type="gramEnd"/>
+      <w:r>
+        <w:rPr>
+          <w:rFonts w:ascii="Calibri" w:eastAsia="Calibri" w:hAnsi="Calibri" w:cs="Calibri"/>
+          <w:kern w:val="0"/>
+          <w:sz w:val="22"/>
+          <w:szCs w:val="22"/>
+          <w14:ligatures w14:val="none"/>
+        </w:rPr>
+        <w:t xml:space="preserve"> what this role requires. I translate commercial priorities into unambiguous data requirements, manage cross-functional backlogs across product, engineering, and analytics teams, and own governance and quality standards that keep data trusted and discoverable. I have hands-on experience with Azure Databricks, data lakes, metadata management, and data catalog tooling, and I hold certifications in Azure Data Fundamentals, PSPO, and AI/RAG for product leaders. My master's degree in IT and Management with a specialization in Data Analytics from Illinois Institute of Technology, combined with a published data analysis paper, reflects the analytical depth I bring to the role.</w:t>
+      </w:r>
+    </w:p>
+    <w:p>
+      <w:pPr>
+        <w:spacing w:after="0"/>
+        <w:jc w:val="both"/>
+        <w:rPr>
+          <w:rFonts w:ascii="Calibri" w:eastAsia="Calibri" w:hAnsi="Calibri" w:cs="Calibri"/>
+          <w:kern w:val="0"/>
+          <w:sz w:val="22"/>
+          <w:szCs w:val="22"/>
+          <w14:ligatures w14:val="none"/>
+        </w:rPr>
+      </w:pPr>
+    </w:p>
+    <w:p>
+      <w:pPr>
+        <w:spacing w:after="0"/>
+        <w:jc w:val="both"/>
+        <w:rPr>
+          <w:rFonts w:ascii="Calibri" w:eastAsia="Calibri" w:hAnsi="Calibri" w:cs="Calibri"/>
+          <w:kern w:val="0"/>
+          <w:sz w:val="22"/>
+          <w:szCs w:val="22"/>
+          <w14:ligatures w14:val="none"/>
+        </w:rPr>
+      </w:pPr>
+      <w:r>
+        <w:rPr>
+          <w:rFonts w:ascii="Calibri" w:eastAsia="Calibri" w:hAnsi="Calibri" w:cs="Calibri"/>
+          <w:kern w:val="0"/>
+          <w:sz w:val="22"/>
+          <w:szCs w:val="22"/>
+          <w14:ligatures w14:val="none"/>
+        </w:rPr>
+        <w:t xml:space="preserve">Oncology is one of the most data-intensive commercial environments in </w:t>
+      </w:r>
+      <w:proofErr w:type="gramStart"/>
+      <w:r>
+        <w:rPr>
+          <w:rFonts w:ascii="Calibri" w:eastAsia="Calibri" w:hAnsi="Calibri" w:cs="Calibri"/>
+          <w:kern w:val="0"/>
+          <w:sz w:val="22"/>
+          <w:szCs w:val="22"/>
+          <w14:ligatures w14:val="none"/>
+        </w:rPr>
+        <w:t>pharma</w:t>
+      </w:r>
+      <w:proofErr w:type="gramEnd"/>
+      <w:r>
+        <w:rPr>
+          <w:rFonts w:ascii="Calibri" w:eastAsia="Calibri" w:hAnsi="Calibri" w:cs="Calibri"/>
+          <w:kern w:val="0"/>
+          <w:sz w:val="22"/>
+          <w:szCs w:val="22"/>
+          <w14:ligatures w14:val="none"/>
+        </w:rPr>
+        <w:t>, and managing multi-source datasets across claims, EHR, specialty pharmacy, and RWE at the pace oncology demands is a genuinely complex product problem. That complexity, combined with the direct impact on patient access to innovative therapies, is what draws me to this role specifically. I am based in Germantown, MD, so the Gaithersburg office is a few minutes away, and the hybrid model works well for me.</w:t>
+      </w:r>
+    </w:p>
+    <w:p>
+      <w:pPr>
+        <w:spacing w:after="0"/>
+        <w:jc w:val="both"/>
+        <w:rPr>
+          <w:rFonts w:ascii="Calibri" w:eastAsia="Calibri" w:hAnsi="Calibri" w:cs="Calibri"/>
+          <w:kern w:val="0"/>
+          <w:sz w:val="22"/>
+          <w:szCs w:val="22"/>
+          <w14:ligatures w14:val="none"/>
+        </w:rPr>
+      </w:pPr>
+    </w:p>
+    <w:p>
+      <w:pPr>
+        <w:spacing w:after="0"/>
+        <w:jc w:val="both"/>
+        <w:rPr>
+          <w:rFonts w:ascii="Calibri" w:eastAsia="Calibri" w:hAnsi="Calibri" w:cs="Calibri"/>
+          <w:kern w:val="0"/>
+          <w:sz w:val="22"/>
+          <w:szCs w:val="22"/>
+          <w14:ligatures w14:val="none"/>
+        </w:rPr>
+      </w:pPr>
+      <w:r>
+        <w:rPr>
+          <w:rFonts w:ascii="Calibri" w:eastAsia="Calibri" w:hAnsi="Calibri" w:cs="Calibri"/>
+          <w:kern w:val="0"/>
+          <w:sz w:val="22"/>
+          <w:szCs w:val="22"/>
+          <w14:ligatures w14:val="none"/>
+        </w:rPr>
+        <w:t xml:space="preserve">I </w:t>
+      </w:r>
+      <w:proofErr w:type="gramStart"/>
+      <w:r>
+        <w:rPr>
+          <w:rFonts w:ascii="Calibri" w:eastAsia="Calibri" w:hAnsi="Calibri" w:cs="Calibri"/>
+          <w:kern w:val="0"/>
+          <w:sz w:val="22"/>
+          <w:szCs w:val="22"/>
+          <w14:ligatures w14:val="none"/>
+        </w:rPr>
+        <w:t>would welcome</w:t>
+      </w:r>
+      <w:proofErr w:type="gramEnd"/>
+      <w:r>
+        <w:rPr>
+          <w:rFonts w:ascii="Calibri" w:eastAsia="Calibri" w:hAnsi="Calibri" w:cs="Calibri"/>
+          <w:kern w:val="0"/>
+          <w:sz w:val="22"/>
+          <w:szCs w:val="22"/>
+          <w14:ligatures w14:val="none"/>
+        </w:rPr>
+        <w:t xml:space="preserve"> the opportunity to discuss how I can contribute to AstraZeneca's Oncology data product vision. Thank you for your consideration.</w:t>
       </w:r>
     </w:p>
     <w:p>
@@ -261,22 +481,12 @@
           <w:szCs w:val="22"/>
           <w14:ligatures w14:val="none"/>
         </w:rPr>
-        <w:t>Megha Kau</w:t>
-      </w:r>
-      <w:r>
-        <w:rPr>
-          <w:rFonts w:ascii="Calibri" w:eastAsia="Calibri" w:hAnsi="Calibri" w:cs="Calibri"/>
-          <w:kern w:val="0"/>
-          <w:sz w:val="22"/>
-          <w:szCs w:val="22"/>
-          <w14:ligatures w14:val="none"/>
-        </w:rPr>
-        <w:t>l</w:t>
+        <w:t>Megha Kaul</w:t>
       </w:r>
     </w:p>
     <w:sectPr>
       <w:pgSz w:w="12240" w:h="15840"/>
-      <w:pgMar w:top="1440" w:right="1440" w:bottom="1440" w:left="1440" w:header="720" w:footer="720" w:gutter="0"/>
+      <w:pgMar w:top="1170" w:right="1440" w:bottom="1440" w:left="1440" w:header="720" w:footer="720" w:gutter="0"/>
       <w:cols w:space="720"/>
       <w:docGrid w:linePitch="360"/>
     </w:sectPr>

</xml_diff>